<commit_message>
Usa la huella de EVIDIA como ícono de la app y documenta la instalación del APK.
Co-authored-by: Cursor <cursoragent@cursor.com>
</commit_message>
<xml_diff>
--- a/docs/Manual-de-uso-EVIDIA.docx
+++ b/docs/Manual-de-uso-EVIDIA.docx
@@ -386,6 +386,25 @@
           <w:sz w:val="22"/>
           <w:szCs w:val="22"/>
         </w:rPr>
+        <w:t xml:space="preserve">EVIDIA se usa desde la aplicación instalada en el teléfono. El único código que se escanea es el de la causa, dentro de EVIDIA, para enviar la evidencia.</w:t>
+      </w:r>
+    </w:p>
+    <w:p>
+      <w:pPr>
+        <w:pStyle w:val="ListParagraph"/>
+        <w:numPr>
+          <w:ilvl w:val="0"/>
+          <w:numId w:val="1"/>
+        </w:numPr>
+        <w:spacing w:after="60"/>
+      </w:pPr>
+      <w:r>
+        <w:rPr>
+          <w:rFonts w:ascii="Calibri" w:cs="Calibri" w:eastAsia="Calibri" w:hAnsi="Calibri"/>
+          <w:color w:val="12263A"/>
+          <w:sz w:val="22"/>
+          <w:szCs w:val="22"/>
+        </w:rPr>
         <w:t xml:space="preserve">El teléfono y la computadora tienen que verse entre sí. Si el teléfono usa el punto de acceso de la PC, la red de la sesión es la que empieza con 192.168.137.</w:t>
       </w:r>
     </w:p>
@@ -405,26 +424,200 @@
           <w:sz w:val="22"/>
           <w:szCs w:val="22"/>
         </w:rPr>
-        <w:t xml:space="preserve">Hay dos códigos distintos. El de Expo Go abre la app. El de la causa, que muestra la estación, se escanea dentro de EVIDIA para enviar la evidencia. No son intercambiables.</w:t>
-      </w:r>
-    </w:p>
-    <w:p>
-      <w:pPr>
-        <w:pStyle w:val="ListParagraph"/>
-        <w:numPr>
-          <w:ilvl w:val="0"/>
-          <w:numId w:val="1"/>
-        </w:numPr>
-        <w:spacing w:after="60"/>
-      </w:pPr>
-      <w:r>
-        <w:rPr>
-          <w:rFonts w:ascii="Calibri" w:cs="Calibri" w:eastAsia="Calibri" w:hAnsi="Calibri"/>
-          <w:color w:val="12263A"/>
-          <w:sz w:val="22"/>
-          <w:szCs w:val="22"/>
-        </w:rPr>
         <w:t xml:space="preserve">Para la captura por cable hace falta un cable de datos, no solo de carga, y aceptar en el teléfono el aviso «Permitir la depuración por USB».</w:t>
+      </w:r>
+    </w:p>
+    <w:p>
+      <w:pPr>
+        <w:pStyle w:val="Heading2"/>
+        <w:spacing w:after="80" w:before="240"/>
+      </w:pPr>
+      <w:r>
+        <w:rPr>
+          <w:rFonts w:ascii="Calibri" w:cs="Calibri" w:eastAsia="Calibri" w:hAnsi="Calibri"/>
+          <w:b/>
+          <w:bCs/>
+          <w:color w:val="12263A"/>
+          <w:sz w:val="24"/>
+          <w:szCs w:val="24"/>
+        </w:rPr>
+        <w:t xml:space="preserve">3.3. Instalar la aplicación</w:t>
+      </w:r>
+    </w:p>
+    <w:p>
+      <w:pPr>
+        <w:spacing w:after="120"/>
+      </w:pPr>
+      <w:r>
+        <w:rPr>
+          <w:rFonts w:ascii="Calibri" w:cs="Calibri" w:eastAsia="Calibri" w:hAnsi="Calibri"/>
+          <w:color w:val="12263A"/>
+          <w:sz w:val="22"/>
+          <w:szCs w:val="22"/>
+        </w:rPr>
+        <w:t xml:space="preserve">Antes de la diligencia, EVIDIA tiene que estar instalada en el teléfono. El archivo es EVIDIA-1.0.apk. Se puede instalar de dos maneras.</w:t>
+      </w:r>
+    </w:p>
+    <w:p>
+      <w:pPr>
+        <w:pStyle w:val="Heading2"/>
+        <w:spacing w:after="80" w:before="240"/>
+      </w:pPr>
+      <w:r>
+        <w:rPr>
+          <w:rFonts w:ascii="Calibri" w:cs="Calibri" w:eastAsia="Calibri" w:hAnsi="Calibri"/>
+          <w:b/>
+          <w:bCs/>
+          <w:color w:val="12263A"/>
+          <w:sz w:val="24"/>
+          <w:szCs w:val="24"/>
+        </w:rPr>
+        <w:t xml:space="preserve">Por cable USB</w:t>
+      </w:r>
+    </w:p>
+    <w:p>
+      <w:pPr>
+        <w:pStyle w:val="ListParagraph"/>
+        <w:numPr>
+          <w:ilvl w:val="0"/>
+          <w:numId w:val="2"/>
+        </w:numPr>
+        <w:spacing w:after="60"/>
+      </w:pPr>
+      <w:r>
+        <w:rPr>
+          <w:rFonts w:ascii="Calibri" w:cs="Calibri" w:eastAsia="Calibri" w:hAnsi="Calibri"/>
+          <w:color w:val="12263A"/>
+          <w:sz w:val="22"/>
+          <w:szCs w:val="22"/>
+        </w:rPr>
+        <w:t xml:space="preserve">Conectar el teléfono con un cable de datos, la pantalla desbloqueada y la depuración USB aceptada.</w:t>
+      </w:r>
+    </w:p>
+    <w:p>
+      <w:pPr>
+        <w:pStyle w:val="ListParagraph"/>
+        <w:numPr>
+          <w:ilvl w:val="0"/>
+          <w:numId w:val="2"/>
+        </w:numPr>
+        <w:spacing w:after="60"/>
+      </w:pPr>
+      <w:r>
+        <w:rPr>
+          <w:rFonts w:ascii="Calibri" w:cs="Calibri" w:eastAsia="Calibri" w:hAnsi="Calibri"/>
+          <w:color w:val="12263A"/>
+          <w:sz w:val="22"/>
+          <w:szCs w:val="22"/>
+        </w:rPr>
+        <w:t xml:space="preserve">En la computadora, instalar el archivo con el comando de ADB: adb install -r seguido de la ruta de EVIDIA-1.0.apk.</w:t>
+      </w:r>
+    </w:p>
+    <w:p>
+      <w:pPr>
+        <w:pStyle w:val="ListParagraph"/>
+        <w:numPr>
+          <w:ilvl w:val="0"/>
+          <w:numId w:val="2"/>
+        </w:numPr>
+        <w:spacing w:after="60"/>
+      </w:pPr>
+      <w:r>
+        <w:rPr>
+          <w:rFonts w:ascii="Calibri" w:cs="Calibri" w:eastAsia="Calibri" w:hAnsi="Calibri"/>
+          <w:color w:val="12263A"/>
+          <w:sz w:val="22"/>
+          <w:szCs w:val="22"/>
+        </w:rPr>
+        <w:t xml:space="preserve">Si el teléfono muestra un aviso para permitir la instalación por USB, tocarlo. En Xiaomi o HyperOS hay que tener activa la opción Instalar vía USB.</w:t>
+      </w:r>
+    </w:p>
+    <w:p>
+      <w:pPr>
+        <w:pStyle w:val="Heading2"/>
+        <w:spacing w:after="80" w:before="240"/>
+      </w:pPr>
+      <w:r>
+        <w:rPr>
+          <w:rFonts w:ascii="Calibri" w:cs="Calibri" w:eastAsia="Calibri" w:hAnsi="Calibri"/>
+          <w:b/>
+          <w:bCs/>
+          <w:color w:val="12263A"/>
+          <w:sz w:val="24"/>
+          <w:szCs w:val="24"/>
+        </w:rPr>
+        <w:t xml:space="preserve">Desde el dispositivo</w:t>
+      </w:r>
+    </w:p>
+    <w:p>
+      <w:pPr>
+        <w:pStyle w:val="ListParagraph"/>
+        <w:numPr>
+          <w:ilvl w:val="0"/>
+          <w:numId w:val="3"/>
+        </w:numPr>
+        <w:spacing w:after="60"/>
+      </w:pPr>
+      <w:r>
+        <w:rPr>
+          <w:rFonts w:ascii="Calibri" w:cs="Calibri" w:eastAsia="Calibri" w:hAnsi="Calibri"/>
+          <w:color w:val="12263A"/>
+          <w:sz w:val="22"/>
+          <w:szCs w:val="22"/>
+        </w:rPr>
+        <w:t xml:space="preserve">Copiar EVIDIA-1.0.apk al almacenamiento interno del teléfono. En el administrador de archivos aparece en la raíz o en la carpeta Download, no en el acceso directo Descargas del navegador.</w:t>
+      </w:r>
+    </w:p>
+    <w:p>
+      <w:pPr>
+        <w:pStyle w:val="ListParagraph"/>
+        <w:numPr>
+          <w:ilvl w:val="0"/>
+          <w:numId w:val="3"/>
+        </w:numPr>
+        <w:spacing w:after="60"/>
+      </w:pPr>
+      <w:r>
+        <w:rPr>
+          <w:rFonts w:ascii="Calibri" w:cs="Calibri" w:eastAsia="Calibri" w:hAnsi="Calibri"/>
+          <w:color w:val="12263A"/>
+          <w:sz w:val="22"/>
+          <w:szCs w:val="22"/>
+        </w:rPr>
+        <w:t xml:space="preserve">Abrir ese archivo en el teléfono y tocar Instalar.</w:t>
+      </w:r>
+    </w:p>
+    <w:p>
+      <w:pPr>
+        <w:pStyle w:val="ListParagraph"/>
+        <w:numPr>
+          <w:ilvl w:val="0"/>
+          <w:numId w:val="3"/>
+        </w:numPr>
+        <w:spacing w:after="60"/>
+      </w:pPr>
+      <w:r>
+        <w:rPr>
+          <w:rFonts w:ascii="Calibri" w:cs="Calibri" w:eastAsia="Calibri" w:hAnsi="Calibri"/>
+          <w:color w:val="12263A"/>
+          <w:sz w:val="22"/>
+          <w:szCs w:val="22"/>
+        </w:rPr>
+        <w:t xml:space="preserve">Si el teléfono pregunta si el administrador de archivos puede instalar aplicaciones, permitirlo.</w:t>
+      </w:r>
+    </w:p>
+    <w:p>
+      <w:pPr>
+        <w:spacing w:after="120"/>
+      </w:pPr>
+      <w:r>
+        <w:rPr>
+          <w:rFonts w:ascii="Calibri" w:cs="Calibri" w:eastAsia="Calibri" w:hAnsi="Calibri"/>
+          <w:color w:val="12263A"/>
+          <w:sz w:val="22"/>
+          <w:szCs w:val="22"/>
+        </w:rPr>
+        <w:t xml:space="preserve">Después de instalarla, EVIDIA se abre como cualquier otra aplicación. No hace falta otro programa para iniciarla.</w:t>
       </w:r>
     </w:p>
     <w:p>
@@ -449,7 +642,7 @@
         <w:pStyle w:val="ListParagraph"/>
         <w:numPr>
           <w:ilvl w:val="0"/>
-          <w:numId w:val="2"/>
+          <w:numId w:val="4"/>
         </w:numPr>
         <w:spacing w:after="60"/>
       </w:pPr>
@@ -468,7 +661,7 @@
         <w:pStyle w:val="ListParagraph"/>
         <w:numPr>
           <w:ilvl w:val="0"/>
-          <w:numId w:val="2"/>
+          <w:numId w:val="4"/>
         </w:numPr>
         <w:spacing w:after="60"/>
       </w:pPr>
@@ -487,7 +680,7 @@
         <w:pStyle w:val="ListParagraph"/>
         <w:numPr>
           <w:ilvl w:val="0"/>
-          <w:numId w:val="2"/>
+          <w:numId w:val="4"/>
         </w:numPr>
         <w:spacing w:after="60"/>
       </w:pPr>
@@ -563,7 +756,7 @@
         <w:pStyle w:val="ListParagraph"/>
         <w:numPr>
           <w:ilvl w:val="0"/>
-          <w:numId w:val="3"/>
+          <w:numId w:val="5"/>
         </w:numPr>
         <w:spacing w:after="60"/>
       </w:pPr>
@@ -582,7 +775,7 @@
         <w:pStyle w:val="ListParagraph"/>
         <w:numPr>
           <w:ilvl w:val="0"/>
-          <w:numId w:val="3"/>
+          <w:numId w:val="5"/>
         </w:numPr>
         <w:spacing w:after="60"/>
       </w:pPr>
@@ -601,7 +794,7 @@
         <w:pStyle w:val="ListParagraph"/>
         <w:numPr>
           <w:ilvl w:val="0"/>
-          <w:numId w:val="3"/>
+          <w:numId w:val="5"/>
         </w:numPr>
         <w:spacing w:after="60"/>
       </w:pPr>
@@ -620,7 +813,7 @@
         <w:pStyle w:val="ListParagraph"/>
         <w:numPr>
           <w:ilvl w:val="0"/>
-          <w:numId w:val="3"/>
+          <w:numId w:val="5"/>
         </w:numPr>
         <w:spacing w:after="60"/>
       </w:pPr>
@@ -639,7 +832,7 @@
         <w:pStyle w:val="ListParagraph"/>
         <w:numPr>
           <w:ilvl w:val="0"/>
-          <w:numId w:val="3"/>
+          <w:numId w:val="5"/>
         </w:numPr>
         <w:spacing w:after="60"/>
       </w:pPr>
@@ -720,7 +913,7 @@
         <w:pStyle w:val="ListParagraph"/>
         <w:numPr>
           <w:ilvl w:val="0"/>
-          <w:numId w:val="4"/>
+          <w:numId w:val="6"/>
         </w:numPr>
         <w:spacing w:after="60"/>
       </w:pPr>
@@ -739,7 +932,7 @@
         <w:pStyle w:val="ListParagraph"/>
         <w:numPr>
           <w:ilvl w:val="0"/>
-          <w:numId w:val="4"/>
+          <w:numId w:val="6"/>
         </w:numPr>
         <w:spacing w:after="60"/>
       </w:pPr>
@@ -758,7 +951,7 @@
         <w:pStyle w:val="ListParagraph"/>
         <w:numPr>
           <w:ilvl w:val="0"/>
-          <w:numId w:val="4"/>
+          <w:numId w:val="6"/>
         </w:numPr>
         <w:spacing w:after="60"/>
       </w:pPr>
@@ -794,26 +987,26 @@
         <w:pStyle w:val="ListParagraph"/>
         <w:numPr>
           <w:ilvl w:val="0"/>
-          <w:numId w:val="5"/>
-        </w:numPr>
-        <w:spacing w:after="60"/>
-      </w:pPr>
-      <w:r>
-        <w:rPr>
-          <w:rFonts w:ascii="Calibri" w:cs="Calibri" w:eastAsia="Calibri" w:hAnsi="Calibri"/>
-          <w:color w:val="12263A"/>
-          <w:sz w:val="22"/>
-          <w:szCs w:val="22"/>
-        </w:rPr>
-        <w:t xml:space="preserve">Abrir EVIDIA. Si está instalada en el teléfono, se abre directo. Si todavía no, se abre con Expo Go mediante el código de la app, no con el código de la causa.</w:t>
-      </w:r>
-    </w:p>
-    <w:p>
-      <w:pPr>
-        <w:pStyle w:val="ListParagraph"/>
-        <w:numPr>
-          <w:ilvl w:val="0"/>
-          <w:numId w:val="5"/>
+          <w:numId w:val="7"/>
+        </w:numPr>
+        <w:spacing w:after="60"/>
+      </w:pPr>
+      <w:r>
+        <w:rPr>
+          <w:rFonts w:ascii="Calibri" w:cs="Calibri" w:eastAsia="Calibri" w:hAnsi="Calibri"/>
+          <w:color w:val="12263A"/>
+          <w:sz w:val="22"/>
+          <w:szCs w:val="22"/>
+        </w:rPr>
+        <w:t xml:space="preserve">Abrir la aplicación EVIDIA ya instalada en el teléfono.</w:t>
+      </w:r>
+    </w:p>
+    <w:p>
+      <w:pPr>
+        <w:pStyle w:val="ListParagraph"/>
+        <w:numPr>
+          <w:ilvl w:val="0"/>
+          <w:numId w:val="7"/>
         </w:numPr>
         <w:spacing w:after="60"/>
       </w:pPr>
@@ -832,7 +1025,7 @@
         <w:pStyle w:val="ListParagraph"/>
         <w:numPr>
           <w:ilvl w:val="0"/>
-          <w:numId w:val="5"/>
+          <w:numId w:val="7"/>
         </w:numPr>
         <w:spacing w:after="60"/>
       </w:pPr>
@@ -851,7 +1044,7 @@
         <w:pStyle w:val="ListParagraph"/>
         <w:numPr>
           <w:ilvl w:val="0"/>
-          <w:numId w:val="5"/>
+          <w:numId w:val="7"/>
         </w:numPr>
         <w:spacing w:after="60"/>
       </w:pPr>
@@ -870,7 +1063,7 @@
         <w:pStyle w:val="ListParagraph"/>
         <w:numPr>
           <w:ilvl w:val="0"/>
-          <w:numId w:val="5"/>
+          <w:numId w:val="7"/>
         </w:numPr>
         <w:spacing w:after="60"/>
       </w:pPr>
@@ -889,7 +1082,7 @@
         <w:pStyle w:val="ListParagraph"/>
         <w:numPr>
           <w:ilvl w:val="0"/>
-          <w:numId w:val="5"/>
+          <w:numId w:val="7"/>
         </w:numPr>
         <w:spacing w:after="60"/>
       </w:pPr>
@@ -908,7 +1101,7 @@
         <w:pStyle w:val="ListParagraph"/>
         <w:numPr>
           <w:ilvl w:val="0"/>
-          <w:numId w:val="5"/>
+          <w:numId w:val="7"/>
         </w:numPr>
         <w:spacing w:after="60"/>
       </w:pPr>
@@ -927,7 +1120,7 @@
         <w:pStyle w:val="ListParagraph"/>
         <w:numPr>
           <w:ilvl w:val="0"/>
-          <w:numId w:val="5"/>
+          <w:numId w:val="7"/>
         </w:numPr>
         <w:spacing w:after="60"/>
       </w:pPr>
@@ -946,7 +1139,7 @@
         <w:pStyle w:val="ListParagraph"/>
         <w:numPr>
           <w:ilvl w:val="0"/>
-          <w:numId w:val="5"/>
+          <w:numId w:val="7"/>
         </w:numPr>
         <w:spacing w:after="60"/>
       </w:pPr>
@@ -982,7 +1175,7 @@
         <w:pStyle w:val="ListParagraph"/>
         <w:numPr>
           <w:ilvl w:val="0"/>
-          <w:numId w:val="6"/>
+          <w:numId w:val="8"/>
         </w:numPr>
         <w:spacing w:after="60"/>
       </w:pPr>
@@ -1001,7 +1194,7 @@
         <w:pStyle w:val="ListParagraph"/>
         <w:numPr>
           <w:ilvl w:val="0"/>
-          <w:numId w:val="6"/>
+          <w:numId w:val="8"/>
         </w:numPr>
         <w:spacing w:after="60"/>
       </w:pPr>
@@ -1020,7 +1213,7 @@
         <w:pStyle w:val="ListParagraph"/>
         <w:numPr>
           <w:ilvl w:val="0"/>
-          <w:numId w:val="6"/>
+          <w:numId w:val="8"/>
         </w:numPr>
         <w:spacing w:after="60"/>
       </w:pPr>
@@ -1087,7 +1280,7 @@
         <w:pStyle w:val="ListParagraph"/>
         <w:numPr>
           <w:ilvl w:val="0"/>
-          <w:numId w:val="7"/>
+          <w:numId w:val="9"/>
         </w:numPr>
         <w:spacing w:after="60"/>
       </w:pPr>
@@ -1106,7 +1299,7 @@
         <w:pStyle w:val="ListParagraph"/>
         <w:numPr>
           <w:ilvl w:val="0"/>
-          <w:numId w:val="7"/>
+          <w:numId w:val="9"/>
         </w:numPr>
         <w:spacing w:after="60"/>
       </w:pPr>
@@ -1125,7 +1318,7 @@
         <w:pStyle w:val="ListParagraph"/>
         <w:numPr>
           <w:ilvl w:val="0"/>
-          <w:numId w:val="7"/>
+          <w:numId w:val="9"/>
         </w:numPr>
         <w:spacing w:after="60"/>
       </w:pPr>
@@ -1144,7 +1337,7 @@
         <w:pStyle w:val="ListParagraph"/>
         <w:numPr>
           <w:ilvl w:val="0"/>
-          <w:numId w:val="7"/>
+          <w:numId w:val="9"/>
         </w:numPr>
         <w:spacing w:after="60"/>
       </w:pPr>
@@ -1163,7 +1356,7 @@
         <w:pStyle w:val="ListParagraph"/>
         <w:numPr>
           <w:ilvl w:val="0"/>
-          <w:numId w:val="7"/>
+          <w:numId w:val="9"/>
         </w:numPr>
         <w:spacing w:after="60"/>
       </w:pPr>
@@ -1199,7 +1392,7 @@
         <w:pStyle w:val="ListParagraph"/>
         <w:numPr>
           <w:ilvl w:val="0"/>
-          <w:numId w:val="8"/>
+          <w:numId w:val="10"/>
         </w:numPr>
         <w:spacing w:after="60"/>
       </w:pPr>
@@ -1218,7 +1411,7 @@
         <w:pStyle w:val="ListParagraph"/>
         <w:numPr>
           <w:ilvl w:val="0"/>
-          <w:numId w:val="8"/>
+          <w:numId w:val="10"/>
         </w:numPr>
         <w:spacing w:after="60"/>
       </w:pPr>
@@ -1237,7 +1430,7 @@
         <w:pStyle w:val="ListParagraph"/>
         <w:numPr>
           <w:ilvl w:val="0"/>
-          <w:numId w:val="8"/>
+          <w:numId w:val="10"/>
         </w:numPr>
         <w:spacing w:after="60"/>
       </w:pPr>
@@ -1256,7 +1449,7 @@
         <w:pStyle w:val="ListParagraph"/>
         <w:numPr>
           <w:ilvl w:val="0"/>
-          <w:numId w:val="8"/>
+          <w:numId w:val="10"/>
         </w:numPr>
         <w:spacing w:after="60"/>
       </w:pPr>
@@ -1275,7 +1468,7 @@
         <w:pStyle w:val="ListParagraph"/>
         <w:numPr>
           <w:ilvl w:val="0"/>
-          <w:numId w:val="8"/>
+          <w:numId w:val="10"/>
         </w:numPr>
         <w:spacing w:after="60"/>
       </w:pPr>
@@ -1337,7 +1530,7 @@
         <w:pStyle w:val="ListParagraph"/>
         <w:numPr>
           <w:ilvl w:val="0"/>
-          <w:numId w:val="9"/>
+          <w:numId w:val="11"/>
         </w:numPr>
         <w:spacing w:after="60"/>
       </w:pPr>
@@ -1356,7 +1549,7 @@
         <w:pStyle w:val="ListParagraph"/>
         <w:numPr>
           <w:ilvl w:val="0"/>
-          <w:numId w:val="9"/>
+          <w:numId w:val="11"/>
         </w:numPr>
         <w:spacing w:after="60"/>
       </w:pPr>
@@ -1375,7 +1568,7 @@
         <w:pStyle w:val="ListParagraph"/>
         <w:numPr>
           <w:ilvl w:val="0"/>
-          <w:numId w:val="9"/>
+          <w:numId w:val="11"/>
         </w:numPr>
         <w:spacing w:after="60"/>
       </w:pPr>
@@ -1394,7 +1587,7 @@
         <w:pStyle w:val="ListParagraph"/>
         <w:numPr>
           <w:ilvl w:val="0"/>
-          <w:numId w:val="9"/>
+          <w:numId w:val="11"/>
         </w:numPr>
         <w:spacing w:after="60"/>
       </w:pPr>
@@ -1413,7 +1606,7 @@
         <w:pStyle w:val="ListParagraph"/>
         <w:numPr>
           <w:ilvl w:val="0"/>
-          <w:numId w:val="9"/>
+          <w:numId w:val="11"/>
         </w:numPr>
         <w:spacing w:after="60"/>
       </w:pPr>
@@ -1432,7 +1625,7 @@
         <w:pStyle w:val="ListParagraph"/>
         <w:numPr>
           <w:ilvl w:val="0"/>
-          <w:numId w:val="9"/>
+          <w:numId w:val="11"/>
         </w:numPr>
         <w:spacing w:after="60"/>
       </w:pPr>
@@ -1581,7 +1774,7 @@
           <w:sz w:val="22"/>
           <w:szCs w:val="22"/>
         </w:rPr>
-        <w:t xml:space="preserve">Revisar que los dos estén en la misma red y que, al abrir la sesión, se haya elegido esa red. El código de Expo Go no sirve para este paso. La sesión no tiene que estar vencida ni cerrada. El firewall de Windows puede pedir permiso a Node la primera vez.</w:t>
+        <w:t xml:space="preserve">Revisar que EVIDIA esté instalada, que el teléfono y la computadora estén en la misma red y que, al abrir la sesión, se haya elegido esa red. El código que se escanea es el de la causa, dentro de la app. La sesión no tiene que estar vencida ni cerrada. El firewall de Windows puede pedir permiso a Node la primera vez.</w:t>
       </w:r>
     </w:p>
     <w:p>
@@ -1730,7 +1923,7 @@
         <w:pStyle w:val="ListParagraph"/>
         <w:numPr>
           <w:ilvl w:val="0"/>
-          <w:numId w:val="10"/>
+          <w:numId w:val="12"/>
         </w:numPr>
         <w:spacing w:after="60"/>
       </w:pPr>
@@ -1749,7 +1942,7 @@
         <w:pStyle w:val="ListParagraph"/>
         <w:numPr>
           <w:ilvl w:val="0"/>
-          <w:numId w:val="10"/>
+          <w:numId w:val="12"/>
         </w:numPr>
         <w:spacing w:after="60"/>
       </w:pPr>
@@ -1768,7 +1961,7 @@
         <w:pStyle w:val="ListParagraph"/>
         <w:numPr>
           <w:ilvl w:val="0"/>
-          <w:numId w:val="10"/>
+          <w:numId w:val="12"/>
         </w:numPr>
         <w:spacing w:after="60"/>
       </w:pPr>
@@ -1787,7 +1980,7 @@
         <w:pStyle w:val="ListParagraph"/>
         <w:numPr>
           <w:ilvl w:val="0"/>
-          <w:numId w:val="10"/>
+          <w:numId w:val="12"/>
         </w:numPr>
         <w:spacing w:after="60"/>
       </w:pPr>
@@ -1806,7 +1999,7 @@
         <w:pStyle w:val="ListParagraph"/>
         <w:numPr>
           <w:ilvl w:val="0"/>
-          <w:numId w:val="10"/>
+          <w:numId w:val="12"/>
         </w:numPr>
         <w:spacing w:after="60"/>
       </w:pPr>
@@ -1825,7 +2018,7 @@
         <w:pStyle w:val="ListParagraph"/>
         <w:numPr>
           <w:ilvl w:val="0"/>
-          <w:numId w:val="10"/>
+          <w:numId w:val="12"/>
         </w:numPr>
         <w:spacing w:after="60"/>
       </w:pPr>
@@ -1844,7 +2037,7 @@
         <w:pStyle w:val="ListParagraph"/>
         <w:numPr>
           <w:ilvl w:val="0"/>
-          <w:numId w:val="10"/>
+          <w:numId w:val="12"/>
         </w:numPr>
         <w:spacing w:after="60"/>
       </w:pPr>
@@ -2208,6 +2401,30 @@
       </w:pPr>
     </w:lvl>
   </w:abstractNum>
+  <w:abstractNum w:abstractNumId="11" w15:restartNumberingAfterBreak="0">
+    <w:multiLevelType w:val="hybridMultilevel"/>
+    <w:lvl w:ilvl="0" w:tentative="1">
+      <w:start w:val="1"/>
+      <w:numFmt w:val="decimal"/>
+      <w:lvlText w:val="%1."/>
+      <w:lvlJc w:val="left"/>
+      <w:pPr>
+        <w:ind w:left="720" w:hanging="360"/>
+      </w:pPr>
+    </w:lvl>
+  </w:abstractNum>
+  <w:abstractNum w:abstractNumId="12" w15:restartNumberingAfterBreak="0">
+    <w:multiLevelType w:val="hybridMultilevel"/>
+    <w:lvl w:ilvl="0" w:tentative="1">
+      <w:start w:val="1"/>
+      <w:numFmt w:val="decimal"/>
+      <w:lvlText w:val="%1."/>
+      <w:lvlJc w:val="left"/>
+      <w:pPr>
+        <w:ind w:left="720" w:hanging="360"/>
+      </w:pPr>
+    </w:lvl>
+  </w:abstractNum>
   <w:num w:numId="1">
     <w:abstractNumId w:val="1"/>
     <w:lvlOverride w:ilvl="0">
@@ -2264,6 +2481,18 @@
   </w:num>
   <w:num w:numId="10">
     <w:abstractNumId w:val="10"/>
+    <w:lvlOverride w:ilvl="0">
+      <w:startOverride w:val="1"/>
+    </w:lvlOverride>
+  </w:num>
+  <w:num w:numId="11">
+    <w:abstractNumId w:val="11"/>
+    <w:lvlOverride w:ilvl="0">
+      <w:startOverride w:val="1"/>
+    </w:lvlOverride>
+  </w:num>
+  <w:num w:numId="12">
+    <w:abstractNumId w:val="12"/>
     <w:lvlOverride w:ilvl="0">
       <w:startOverride w:val="1"/>
     </w:lvlOverride>

</xml_diff>